<commit_message>
English literature reviews 6-10 (translated and fidelity-reviewed)
Neural operators, PINN, inverse problems and data assimilation, information
theory, statistical physics.

Co-Authored-By: Claude Opus 5.5 <noreply@anthropic.com>
Claude-Session: https://claude.ai/code/session_016Cdcj2FTAQGBVsJUyYJR2M
</commit_message>
<xml_diff>
--- a/docs/literature/Literature_review_Belief_Updating_2020-2026.docx
+++ b/docs/literature/Literature_review_Belief_Updating_2020-2026.docx
@@ -3005,7 +3005,7 @@
         <w:jc w:val="both"/>
       </w:pPr>
       <w:r>
-        <w:t xml:space="preserve">Sequential updating is done with sequential Monte Carlo, where the Feynman–Kac formula gives the path distribution and the normalizing constant [B12]. Optimal proposals come from an optimal control problem [O4]; couplings remove the bias of MCMC [H1] and give computable bounds on the distance from the posterior [H2]. Contraction theory studies how fast the posterior concentrates around the truth [B13] [O6]. Dempster–Shafer theory extends Bayesian updating with lower and upper probabilities [B14] [H3], while outcome indistinguishability defines when the probabilistic beliefs of a predictor are “unrefutable” by every efficient test [H4].</w:t>
+        <w:t xml:space="preserve">Sequential updating is done with sequential Monte Carlo, where the Feynman–Kac formula gives the path distribution and the normalizing constant [B12]. Optimal proposals come from an optimal control problem [O4]; couplings remove the bias of MCMC [H1] and give computable bounds on the distance from the posterior [H2]. Contraction theory studies how fast the posterior concentrates around the truth [B13] [O6]. Dempster–Shafer theory extends Bayesian updating with lower and upper probabilities [B14] [H3], while outcome indistinguishability defines when the probabilistic beliefs of a predictor are “irrefutable” by any efficient test [H4].</w:t>
       </w:r>
     </w:p>
     <w:p>
@@ -5934,7 +5934,7 @@
             <w:vAlign w:val="top"/>
           </w:tcPr>
           <w:p>
-            <w:hyperlink w:history="1" r:id="rIdknqom02rjjb1-qt2hkehj">
+            <w:hyperlink w:history="1" r:id="rIddbeu3tpg7yibru0uguvef">
               <w:r>
                 <w:rPr>
                   <w:color w:val="1D4ED8"/>
@@ -7041,7 +7041,7 @@
             <w:vAlign w:val="top"/>
           </w:tcPr>
           <w:p>
-            <w:hyperlink w:history="1" r:id="rIdnjpboqowibtere4adrb6a">
+            <w:hyperlink w:history="1" r:id="rIdmomtb0ah6bzvblakjfczl">
               <w:r>
                 <w:rPr>
                   <w:color w:val="1D4ED8"/>
@@ -8083,7 +8083,7 @@
             <w:vAlign w:val="top"/>
           </w:tcPr>
           <w:p>
-            <w:hyperlink w:history="1" r:id="rIdpvzlffciotj1b9c0smsf3">
+            <w:hyperlink w:history="1" r:id="rIdirbaiuus7a3zesl52mmjv">
               <w:r>
                 <w:rPr>
                   <w:color w:val="1D4ED8"/>
@@ -9164,7 +9164,7 @@
             <w:vAlign w:val="top"/>
           </w:tcPr>
           <w:p>
-            <w:hyperlink w:history="1" r:id="rIdymmvau0djndmzzitlkj_i">
+            <w:hyperlink w:history="1" r:id="rIdxjwajaxlsw-sl5prfyiyc">
               <w:r>
                 <w:rPr>
                   <w:color w:val="1D4ED8"/>
@@ -10405,7 +10405,7 @@
             <w:vAlign w:val="top"/>
           </w:tcPr>
           <w:p>
-            <w:hyperlink w:history="1" r:id="rIdufdo_y9fyk1lxcljxfhbh">
+            <w:hyperlink w:history="1" r:id="rIdwf7vwwrm7v89bqrg3z6c2">
               <w:r>
                 <w:rPr>
                   <w:color w:val="1D4ED8"/>
@@ -10596,7 +10596,7 @@
         <w:t xml:space="preserve">Summary. </w:t>
       </w:r>
       <w:r>
-        <w:t xml:space="preserve">The IPF (Sinkhorn) algorithm rescales a reference coupling in turn so that it matches two given marginals; each half-step is a KL projection, i.e., a belief update on a marginal constraint. Its limit is the entropy-regularized optimal transport plan, also called the static Schrödinger bridge. The article proves that the IPF iterates are stable under perturbations of the marginals, with a quantitative bound in the Wasserstein-1 distance that holds uniformly over all iterations. A quantitative stability result for Schrödinger bridges follows as a consequence.</w:t>
+        <w:t xml:space="preserve">The IPF (Sinkhorn) algorithm alternately rescales a reference coupling so that it matches two given marginals; each half-step is a KL projection, i.e., a belief update on a marginal constraint. Its limit is the entropy-regularized optimal transport plan, also called the static Schrödinger bridge. The article proves that the IPF iterates are stable under perturbations of the marginals, with a quantitative bound in the Wasserstein-1 distance that holds uniformly over all iterations. A quantitative stability result for Schrödinger bridges follows as a consequence.</w:t>
       </w:r>
     </w:p>
     <w:p>
@@ -11660,7 +11660,7 @@
             <w:vAlign w:val="top"/>
           </w:tcPr>
           <w:p>
-            <w:hyperlink w:history="1" r:id="rId3_yg9jalvjundqkdf4j10">
+            <w:hyperlink w:history="1" r:id="rIdamiolxaodmrry4f_qdtka">
               <w:r>
                 <w:rPr>
                   <w:color w:val="1D4ED8"/>
@@ -12912,7 +12912,7 @@
             <w:vAlign w:val="top"/>
           </w:tcPr>
           <w:p>
-            <w:hyperlink w:history="1" r:id="rId6pemv-g4utibfcaf-ucxn">
+            <w:hyperlink w:history="1" r:id="rIdssoldpigztljbchc8brlk">
               <w:r>
                 <w:rPr>
                   <w:color w:val="1D4ED8"/>
@@ -14241,7 +14241,7 @@
             <w:vAlign w:val="top"/>
           </w:tcPr>
           <w:p>
-            <w:hyperlink w:history="1" r:id="rIdbowqj7g0z1_uto2axkmbe">
+            <w:hyperlink w:history="1" r:id="rId0b8ky9niknags9izpiuue">
               <w:r>
                 <w:rPr>
                   <w:color w:val="1D4ED8"/>
@@ -15797,7 +15797,7 @@
             <w:vAlign w:val="top"/>
           </w:tcPr>
           <w:p>
-            <w:hyperlink w:history="1" r:id="rIdndbssvh7kn3dqasojd1aj">
+            <w:hyperlink w:history="1" r:id="rIdqiueyal1jyjnetky3nt9i">
               <w:r>
                 <w:rPr>
                   <w:color w:val="1D4ED8"/>
@@ -17021,7 +17021,7 @@
             <w:vAlign w:val="top"/>
           </w:tcPr>
           <w:p>
-            <w:hyperlink w:history="1" r:id="rId6xguw2evwq49e1xllsxcg">
+            <w:hyperlink w:history="1" r:id="rIdj46aqa6wc7mdxvvrzsekf">
               <w:r>
                 <w:rPr>
                   <w:color w:val="1D4ED8"/>
@@ -18136,7 +18136,7 @@
             <w:vAlign w:val="top"/>
           </w:tcPr>
           <w:p>
-            <w:hyperlink w:history="1" r:id="rIda0dt6oilc3j_mos-dkooq">
+            <w:hyperlink w:history="1" r:id="rIdaikzqllxvevbswlenml1d">
               <w:r>
                 <w:rPr>
                   <w:color w:val="1D4ED8"/>
@@ -19066,7 +19066,7 @@
             <w:vAlign w:val="top"/>
           </w:tcPr>
           <w:p>
-            <w:hyperlink w:history="1" r:id="rIdffoc36jkpehscpnfjlk8a">
+            <w:hyperlink w:history="1" r:id="rIdrjexbgbt_z_iis5ffrhzj">
               <w:r>
                 <w:rPr>
                   <w:color w:val="1D4ED8"/>
@@ -19903,7 +19903,7 @@
             <w:vAlign w:val="top"/>
           </w:tcPr>
           <w:p>
-            <w:hyperlink w:history="1" r:id="rIdhmapm6qapiaklcmyx5qv3">
+            <w:hyperlink w:history="1" r:id="rIdwrz4erkkzfioxbyylh4ew">
               <w:r>
                 <w:rPr>
                   <w:color w:val="1D4ED8"/>
@@ -20952,7 +20952,7 @@
             <w:vAlign w:val="top"/>
           </w:tcPr>
           <w:p>
-            <w:hyperlink w:history="1" r:id="rIdkymtk2nkbxcfu7pmc8g8-">
+            <w:hyperlink w:history="1" r:id="rIdfnpdjk1oii2mmfu6deivo">
               <w:r>
                 <w:rPr>
                   <w:color w:val="1D4ED8"/>
@@ -21949,7 +21949,7 @@
             <w:vAlign w:val="top"/>
           </w:tcPr>
           <w:p>
-            <w:hyperlink w:history="1" r:id="rIdtxyzabrvdu89qxizzhc3o">
+            <w:hyperlink w:history="1" r:id="rIdcimdxl79ayrohgexfqj4y">
               <w:r>
                 <w:rPr>
                   <w:color w:val="1D4ED8"/>
@@ -23276,7 +23276,7 @@
             <w:vAlign w:val="top"/>
           </w:tcPr>
           <w:p>
-            <w:hyperlink w:history="1" r:id="rIdkqiufvwkfxolnj7gszonc">
+            <w:hyperlink w:history="1" r:id="rIdua6jlsappesgpl9imu--s">
               <w:r>
                 <w:rPr>
                   <w:color w:val="1D4ED8"/>
@@ -24203,7 +24203,7 @@
             <w:vAlign w:val="top"/>
           </w:tcPr>
           <w:p>
-            <w:hyperlink w:history="1" r:id="rIdigfrihzwf5gbqnxnimrwb">
+            <w:hyperlink w:history="1" r:id="rIdhakvx1uopei1i1uu4vnw7">
               <w:r>
                 <w:rPr>
                   <w:color w:val="1D4ED8"/>
@@ -25414,7 +25414,7 @@
             <w:vAlign w:val="top"/>
           </w:tcPr>
           <w:p>
-            <w:hyperlink w:history="1" r:id="rIdtijpagaubk6qmogwejruw">
+            <w:hyperlink w:history="1" r:id="rIdhipc5sj9shgqh1jypdvet">
               <w:r>
                 <w:rPr>
                   <w:color w:val="1D4ED8"/>
@@ -26580,7 +26580,7 @@
             <w:vAlign w:val="top"/>
           </w:tcPr>
           <w:p>
-            <w:hyperlink w:history="1" r:id="rIdqydz5qwwhcb08cgxlthei">
+            <w:hyperlink w:history="1" r:id="rId-vzzgooa3qrifjmq4yyao">
               <w:r>
                 <w:rPr>
                   <w:color w:val="1D4ED8"/>
@@ -28031,7 +28031,7 @@
             <w:vAlign w:val="top"/>
           </w:tcPr>
           <w:p>
-            <w:hyperlink w:history="1" r:id="rIdn7qzt2cucfpcba9ncah44">
+            <w:hyperlink w:history="1" r:id="rIdplxuejdvnvmjjps71krai">
               <w:r>
                 <w:rPr>
                   <w:color w:val="1D4ED8"/>
@@ -30565,7 +30565,7 @@
                 <w:sz w:val="17"/>
                 <w:szCs w:val="17"/>
               </w:rPr>
-              <w:t xml:space="preserve">When has the chain arrived?</w:t>
+              <w:t xml:space="preserve">When has the chain reached the posterior?</w:t>
             </w:r>
           </w:p>
         </w:tc>
@@ -31308,7 +31308,7 @@
               </w:rPr>
               <w:t xml:space="preserve">, 30(5), 2274–2310. </w:t>
             </w:r>
-            <w:hyperlink w:history="1" r:id="rId8_qncnauvzjup9exqbsoi">
+            <w:hyperlink w:history="1" r:id="rIdv2kwmzpyjnxtvbdf2drjg">
               <w:r>
                 <w:rPr>
                   <w:color w:val="1D4ED8"/>
@@ -31405,7 +31405,7 @@
               </w:rPr>
               <w:t xml:space="preserve">, 30(2), 1257–1286. </w:t>
             </w:r>
-            <w:hyperlink w:history="1" r:id="rIdckdrjycyguxgcbqckedhx">
+            <w:hyperlink w:history="1" r:id="rIdajri05nbbpgiwrxoek_du">
               <w:r>
                 <w:rPr>
                   <w:color w:val="1D4ED8"/>
@@ -31501,7 +31501,7 @@
               </w:rPr>
               <w:t xml:space="preserve">, 92(4), 995–1031. </w:t>
             </w:r>
-            <w:hyperlink w:history="1" r:id="rIdvm1lwh4m8jh_r_fiuxc1c">
+            <w:hyperlink w:history="1" r:id="rIdiv4_nls2y-txyty53irk5">
               <w:r>
                 <w:rPr>
                   <w:color w:val="1D4ED8"/>
@@ -31598,7 +31598,7 @@
               </w:rPr>
               <w:t xml:space="preserve">, 94(354), 1863–1909. </w:t>
             </w:r>
-            <w:hyperlink w:history="1" r:id="rIdli_z61z-669uvflg1ug7f">
+            <w:hyperlink w:history="1" r:id="rIdvpbym3xokuoz0_fuedp94">
               <w:r>
                 <w:rPr>
                   <w:color w:val="1D4ED8"/>
@@ -31694,7 +31694,7 @@
               </w:rPr>
               <w:t xml:space="preserve">. </w:t>
             </w:r>
-            <w:hyperlink w:history="1" r:id="rIdd5fby8olfuh_6llnlwze2">
+            <w:hyperlink w:history="1" r:id="rIdmiwuhnhu4jwuptanbb2jp">
               <w:r>
                 <w:rPr>
                   <w:color w:val="1D4ED8"/>
@@ -31791,7 +31791,7 @@
               </w:rPr>
               <w:t xml:space="preserve">, 32(4), 1745–1766. </w:t>
             </w:r>
-            <w:hyperlink w:history="1" r:id="rIdlnul5xwwyhz0djhspm_8m">
+            <w:hyperlink w:history="1" r:id="rIdehwzp5ttbxsjq_q5zxbd0">
               <w:r>
                 <w:rPr>
                   <w:color w:val="1D4ED8"/>
@@ -35343,7 +35343,7 @@
         </w:rPr>
         <w:t xml:space="preserve"> </w:t>
       </w:r>
-      <w:hyperlink w:history="1" r:id="rIdaaorls0ayasr615zwuqot">
+      <w:hyperlink w:history="1" r:id="rIdsppe87ic4v6-zuhxqoect">
         <w:r>
           <w:rPr>
             <w:color w:val="1D4ED8"/>
@@ -35404,7 +35404,7 @@
         </w:rPr>
         <w:t xml:space="preserve"> </w:t>
       </w:r>
-      <w:hyperlink w:history="1" r:id="rIddizaau38mj0s7l3lsfdkz">
+      <w:hyperlink w:history="1" r:id="rIdujs77vrzu_nebm994d8ox">
         <w:r>
           <w:rPr>
             <w:color w:val="1D4ED8"/>
@@ -35508,7 +35508,7 @@
         </w:rPr>
         <w:t xml:space="preserve"> </w:t>
       </w:r>
-      <w:hyperlink w:history="1" r:id="rIdps_bdxsl_kf8w4d5unbdu">
+      <w:hyperlink w:history="1" r:id="rIdvbqvc8zfwpa46cncc4dhh">
         <w:r>
           <w:rPr>
             <w:color w:val="1D4ED8"/>
@@ -35569,7 +35569,7 @@
         </w:rPr>
         <w:t xml:space="preserve"> </w:t>
       </w:r>
-      <w:hyperlink w:history="1" r:id="rIdlzkvjnz205syn-nzm70fs">
+      <w:hyperlink w:history="1" r:id="rIdamr9hmsmvmrh6tdisyt3m">
         <w:r>
           <w:rPr>
             <w:color w:val="1D4ED8"/>
@@ -35630,7 +35630,7 @@
         </w:rPr>
         <w:t xml:space="preserve"> </w:t>
       </w:r>
-      <w:hyperlink w:history="1" r:id="rId41sjhajl_pnwpnaelumll">
+      <w:hyperlink w:history="1" r:id="rIdetgt8pf-eyl774tuyy0xx">
         <w:r>
           <w:rPr>
             <w:color w:val="1D4ED8"/>
@@ -35691,7 +35691,7 @@
         </w:rPr>
         <w:t xml:space="preserve"> </w:t>
       </w:r>
-      <w:hyperlink w:history="1" r:id="rIdabgvuosdwwo5irxpbauna">
+      <w:hyperlink w:history="1" r:id="rId0b-6hfiqwwygabwveqlrk">
         <w:r>
           <w:rPr>
             <w:color w:val="1D4ED8"/>
@@ -35752,7 +35752,7 @@
         </w:rPr>
         <w:t xml:space="preserve"> </w:t>
       </w:r>
-      <w:hyperlink w:history="1" r:id="rIdhh8-k7jhfmr80utnmhkuo">
+      <w:hyperlink w:history="1" r:id="rIdjwkzpbfs0e1nm8mfm9ags">
         <w:r>
           <w:rPr>
             <w:color w:val="1D4ED8"/>
@@ -35813,7 +35813,7 @@
         </w:rPr>
         <w:t xml:space="preserve"> </w:t>
       </w:r>
-      <w:hyperlink w:history="1" r:id="rIda9bdn0xydwbv0lts8gqxo">
+      <w:hyperlink w:history="1" r:id="rId8jnh5c8bhunlubcgph_xd">
         <w:r>
           <w:rPr>
             <w:color w:val="1D4ED8"/>
@@ -35874,7 +35874,7 @@
         </w:rPr>
         <w:t xml:space="preserve"> </w:t>
       </w:r>
-      <w:hyperlink w:history="1" r:id="rIdfmo3oukje6gkcimieocxg">
+      <w:hyperlink w:history="1" r:id="rIdckdlxv0lwtelhrlrttkwt">
         <w:r>
           <w:rPr>
             <w:color w:val="1D4ED8"/>
@@ -35935,7 +35935,7 @@
         </w:rPr>
         <w:t xml:space="preserve"> </w:t>
       </w:r>
-      <w:hyperlink w:history="1" r:id="rIdq0twxu6he6icawe9ooxtm">
+      <w:hyperlink w:history="1" r:id="rIdmuamx4261k3ymja0fyyfo">
         <w:r>
           <w:rPr>
             <w:color w:val="1D4ED8"/>
@@ -35996,7 +35996,7 @@
         </w:rPr>
         <w:t xml:space="preserve"> </w:t>
       </w:r>
-      <w:hyperlink w:history="1" r:id="rIdvg7bi3jzux4dlzb8esivy">
+      <w:hyperlink w:history="1" r:id="rIdtuxurogg8jqx1s2nmjjsx">
         <w:r>
           <w:rPr>
             <w:color w:val="1D4ED8"/>
@@ -36057,7 +36057,7 @@
         </w:rPr>
         <w:t xml:space="preserve"> </w:t>
       </w:r>
-      <w:hyperlink w:history="1" r:id="rIdrokky5z-lmn6yzw_rt88w">
+      <w:hyperlink w:history="1" r:id="rIdoa0s5_lz1lv6jcysrca2h">
         <w:r>
           <w:rPr>
             <w:color w:val="1D4ED8"/>
@@ -36118,7 +36118,7 @@
         </w:rPr>
         <w:t xml:space="preserve"> </w:t>
       </w:r>
-      <w:hyperlink w:history="1" r:id="rId1ruxo6xhc7c4ybiagfplq">
+      <w:hyperlink w:history="1" r:id="rIdsaxdkmqqibtlztfez1ch6">
         <w:r>
           <w:rPr>
             <w:color w:val="1D4ED8"/>
@@ -36179,7 +36179,7 @@
         </w:rPr>
         <w:t xml:space="preserve"> </w:t>
       </w:r>
-      <w:hyperlink w:history="1" r:id="rIdotvw-lfp0s7m86b-pwxjn">
+      <w:hyperlink w:history="1" r:id="rIdi5xaacwow1rd_bsyb48v6">
         <w:r>
           <w:rPr>
             <w:color w:val="1D4ED8"/>
@@ -36251,7 +36251,7 @@
         </w:rPr>
         <w:t xml:space="preserve"> </w:t>
       </w:r>
-      <w:hyperlink w:history="1" r:id="rIdfuwe6frcbzopmwpgme9fq">
+      <w:hyperlink w:history="1" r:id="rIdjew981rqhd_ieyxkgkogv">
         <w:r>
           <w:rPr>
             <w:color w:val="1D4ED8"/>
@@ -36312,7 +36312,7 @@
         </w:rPr>
         <w:t xml:space="preserve"> </w:t>
       </w:r>
-      <w:hyperlink w:history="1" r:id="rId2o5gomph0qnv-jtyarjsw">
+      <w:hyperlink w:history="1" r:id="rIdzdxkygtnveeey7opzsjc6">
         <w:r>
           <w:rPr>
             <w:color w:val="1D4ED8"/>
@@ -36373,7 +36373,7 @@
         </w:rPr>
         <w:t xml:space="preserve"> </w:t>
       </w:r>
-      <w:hyperlink w:history="1" r:id="rIdh1m4ri3pllm6imev2dv2n">
+      <w:hyperlink w:history="1" r:id="rIdssr2njzsgi8org8nchuam">
         <w:r>
           <w:rPr>
             <w:color w:val="1D4ED8"/>
@@ -36434,7 +36434,7 @@
         </w:rPr>
         <w:t xml:space="preserve"> </w:t>
       </w:r>
-      <w:hyperlink w:history="1" r:id="rIdvc7egn2oqhaaztoa1e6dn">
+      <w:hyperlink w:history="1" r:id="rIdz3ip3ttte3gsndaqaswhi">
         <w:r>
           <w:rPr>
             <w:color w:val="1D4ED8"/>
@@ -36495,7 +36495,7 @@
         </w:rPr>
         <w:t xml:space="preserve"> </w:t>
       </w:r>
-      <w:hyperlink w:history="1" r:id="rIdkboh3tfuvdglsqvcilcy3">
+      <w:hyperlink w:history="1" r:id="rId_rqxmoqpzqzhd134zi5xm">
         <w:r>
           <w:rPr>
             <w:color w:val="1D4ED8"/>
@@ -36556,7 +36556,7 @@
         </w:rPr>
         <w:t xml:space="preserve"> </w:t>
       </w:r>
-      <w:hyperlink w:history="1" r:id="rIdebrm_592rngohvl_c6su5">
+      <w:hyperlink w:history="1" r:id="rId5co8tpkojkdhxdylzzqsv">
         <w:r>
           <w:rPr>
             <w:color w:val="1D4ED8"/>
@@ -36617,7 +36617,7 @@
         </w:rPr>
         <w:t xml:space="preserve"> </w:t>
       </w:r>
-      <w:hyperlink w:history="1" r:id="rIdfjvfso1lg9ord6hjetmir">
+      <w:hyperlink w:history="1" r:id="rIdohru8lu1ebmg_fj509n6k">
         <w:r>
           <w:rPr>
             <w:color w:val="1D4ED8"/>
@@ -36678,7 +36678,7 @@
         </w:rPr>
         <w:t xml:space="preserve"> </w:t>
       </w:r>
-      <w:hyperlink w:history="1" r:id="rIdqqsm1pp9phtkjnd1emwpf">
+      <w:hyperlink w:history="1" r:id="rIdbjftmavqu1zu0b-75fyg1">
         <w:r>
           <w:rPr>
             <w:color w:val="1D4ED8"/>
@@ -36739,7 +36739,7 @@
         </w:rPr>
         <w:t xml:space="preserve"> </w:t>
       </w:r>
-      <w:hyperlink w:history="1" r:id="rId7hd4myergctwxybl76poe">
+      <w:hyperlink w:history="1" r:id="rIdp1fylescyhxywxsikkaav">
         <w:r>
           <w:rPr>
             <w:color w:val="1D4ED8"/>
@@ -36800,7 +36800,7 @@
         </w:rPr>
         <w:t xml:space="preserve"> </w:t>
       </w:r>
-      <w:hyperlink w:history="1" r:id="rIdyujavezzpqqatkxdd5vty">
+      <w:hyperlink w:history="1" r:id="rIdl63yjz66xvj6oqrvx5twh">
         <w:r>
           <w:rPr>
             <w:color w:val="1D4ED8"/>
@@ -36861,7 +36861,7 @@
         </w:rPr>
         <w:t xml:space="preserve"> </w:t>
       </w:r>
-      <w:hyperlink w:history="1" r:id="rIdnylfdn2ryyrwinmaxgden">
+      <w:hyperlink w:history="1" r:id="rIddposijyqhmrdvvocxgsld">
         <w:r>
           <w:rPr>
             <w:color w:val="1D4ED8"/>
@@ -36922,7 +36922,7 @@
         </w:rPr>
         <w:t xml:space="preserve"> </w:t>
       </w:r>
-      <w:hyperlink w:history="1" r:id="rIdu84kuaynof6ljq_6sapzy">
+      <w:hyperlink w:history="1" r:id="rIdiifycuvphqipvluismh8g">
         <w:r>
           <w:rPr>
             <w:color w:val="1D4ED8"/>
@@ -36983,7 +36983,7 @@
         </w:rPr>
         <w:t xml:space="preserve"> </w:t>
       </w:r>
-      <w:hyperlink w:history="1" r:id="rIdpuc2e3fyxjyib6nce4qbu">
+      <w:hyperlink w:history="1" r:id="rIdoaeldli00qhymedaeiodv">
         <w:r>
           <w:rPr>
             <w:color w:val="1D4ED8"/>
@@ -37044,7 +37044,7 @@
         </w:rPr>
         <w:t xml:space="preserve"> </w:t>
       </w:r>
-      <w:hyperlink w:history="1" r:id="rIdigis_pk3nfrxtcxy4sihp">
+      <w:hyperlink w:history="1" r:id="rIdop_ixsmw90uqv9ll2omtn">
         <w:r>
           <w:rPr>
             <w:color w:val="1D4ED8"/>
@@ -37105,7 +37105,7 @@
         </w:rPr>
         <w:t xml:space="preserve"> </w:t>
       </w:r>
-      <w:hyperlink w:history="1" r:id="rIdh03stwuoucpijz7ahntjk">
+      <w:hyperlink w:history="1" r:id="rIdgfjfosciqutvyqy45n1f0">
         <w:r>
           <w:rPr>
             <w:color w:val="1D4ED8"/>
@@ -37166,7 +37166,7 @@
         </w:rPr>
         <w:t xml:space="preserve"> </w:t>
       </w:r>
-      <w:hyperlink w:history="1" r:id="rIdtrmoogn5s71icxykr-sbg">
+      <w:hyperlink w:history="1" r:id="rIdvxqv5gbxmn0bn9psbt-qo">
         <w:r>
           <w:rPr>
             <w:color w:val="1D4ED8"/>
@@ -37227,7 +37227,7 @@
         </w:rPr>
         <w:t xml:space="preserve"> </w:t>
       </w:r>
-      <w:hyperlink w:history="1" r:id="rIdxzvnav8bx5iphncdiul2c">
+      <w:hyperlink w:history="1" r:id="rIdpyfxruvdxc8e-33lqq6re">
         <w:r>
           <w:rPr>
             <w:color w:val="1D4ED8"/>
@@ -37288,7 +37288,7 @@
         </w:rPr>
         <w:t xml:space="preserve"> </w:t>
       </w:r>
-      <w:hyperlink w:history="1" r:id="rIdbcdoi4ue53d0btjysshh0">
+      <w:hyperlink w:history="1" r:id="rIdznp-ljs2-ut4you11iwny">
         <w:r>
           <w:rPr>
             <w:color w:val="1D4ED8"/>
@@ -37349,7 +37349,7 @@
         </w:rPr>
         <w:t xml:space="preserve"> </w:t>
       </w:r>
-      <w:hyperlink w:history="1" r:id="rIdz_ivc-_uydjywaelgwqn-">
+      <w:hyperlink w:history="1" r:id="rIdj1n1u5-m72xuc5pni_feh">
         <w:r>
           <w:rPr>
             <w:color w:val="1D4ED8"/>
@@ -37410,7 +37410,7 @@
         </w:rPr>
         <w:t xml:space="preserve"> </w:t>
       </w:r>
-      <w:hyperlink w:history="1" r:id="rId622mat53lpxj8z0dat7qx">
+      <w:hyperlink w:history="1" r:id="rId5eolhzx5cvxhpsqyzgr3f">
         <w:r>
           <w:rPr>
             <w:color w:val="1D4ED8"/>

</xml_diff>